<commit_message>
Regenerate all UKES appendix Word documents (.docx) from source markdown
Rebuild the full docx/ folder via pandoc so it matches the self-funded
3-year plan already reflected in the PDFs and Excel model — the
previous .docx exports (dated 2 Aug) still had the old £150k pre-seed
numbers. Verified every file for stale figures before committing.

Co-Authored-By: Claude Sonnet 5 <noreply@anthropic.com>
</commit_message>
<xml_diff>
--- a/visa_appendices/docx/A_founder_academic_certificates.docx
+++ b/visa_appendices/docx/A_founder_academic_certificates.docx
@@ -2,7 +2,15 @@
 <file path=word/document.xml><?xml version="1.0" encoding="utf-8"?>
 <w:document xmlns:w="http://schemas.openxmlformats.org/wordprocessingml/2006/main" xmlns:m="http://schemas.openxmlformats.org/officeDocument/2006/math" xmlns:r="http://schemas.openxmlformats.org/officeDocument/2006/relationships" xmlns:o="urn:schemas-microsoft-com:office:office" xmlns:v="urn:schemas-microsoft-com:vml" xmlns:w10="urn:schemas-microsoft-com:office:word" xmlns:a="http://schemas.openxmlformats.org/drawingml/2006/main" xmlns:pic="http://schemas.openxmlformats.org/drawingml/2006/picture" xmlns:wp="http://schemas.openxmlformats.org/drawingml/2006/wordprocessingDrawing">
   <w:body>
-    <w:bookmarkStart w:id="24" w:name="X4057856800ec6fbc87701384b725d1d63efb1e6"/>
+    <w:p>
+      <w:pPr>
+        <w:pStyle w:val="Title"/>
+      </w:pPr>
+      <w:r>
+        <w:t xml:space="preserve">A_founder_academic_certificates</w:t>
+      </w:r>
+    </w:p>
+    <w:bookmarkStart w:id="13" w:name="appendix-a-founder-academic-certificates"/>
     <w:p>
       <w:pPr>
         <w:pStyle w:val="Heading1"/>
@@ -17,8 +25,8 @@
       </w:pPr>
       <w:r>
         <w:rPr>
+          <w:i/>
           <w:iCs/>
-          <w:i/>
         </w:rPr>
         <w:t xml:space="preserve">Declared and prepared by Yusuf Quadri, Founder &amp; CEO, DEQUAD Ltd.</w:t>
       </w:r>
@@ -38,7 +46,7 @@
         </w:pict>
       </w:r>
     </w:p>
-    <w:bookmarkStart w:id="20" w:name="qualifications-declared"/>
+    <w:bookmarkStart w:id="9" w:name="qualifications-declared"/>
     <w:p>
       <w:pPr>
         <w:pStyle w:val="Heading2"/>
@@ -50,7 +58,8 @@
     <w:tbl>
       <w:tblPr>
         <w:tblStyle w:val="Table"/>
-        <w:tblW w:type="auto" w:w="0"/>
+        <w:tblW w:type="pct" w:w="5000"/>
+        <w:tblLayout w:type="fixed"/>
         <w:tblLook w:firstRow="1" w:lastRow="0" w:firstColumn="0" w:lastColumn="0" w:noHBand="0" w:noVBand="0" w:val="0020"/>
       </w:tblPr>
       <w:tblGrid>
@@ -62,14 +71,13 @@
       </w:tblGrid>
       <w:tr>
         <w:trPr>
-          <w:tblHeader w:val="true"/>
+          <w:tblHeader w:val="on"/>
         </w:trPr>
         <w:tc>
           <w:tcPr/>
           <w:p>
             <w:pPr>
               <w:pStyle w:val="Compact"/>
-              <w:jc w:val="left"/>
             </w:pPr>
             <w:r>
               <w:t xml:space="preserve">#</w:t>
@@ -81,7 +89,6 @@
           <w:p>
             <w:pPr>
               <w:pStyle w:val="Compact"/>
-              <w:jc w:val="left"/>
             </w:pPr>
             <w:r>
               <w:t xml:space="preserve">Qualification</w:t>
@@ -93,7 +100,6 @@
           <w:p>
             <w:pPr>
               <w:pStyle w:val="Compact"/>
-              <w:jc w:val="left"/>
             </w:pPr>
             <w:r>
               <w:t xml:space="preserve">Awarding institution</w:t>
@@ -105,7 +111,6 @@
           <w:p>
             <w:pPr>
               <w:pStyle w:val="Compact"/>
-              <w:jc w:val="left"/>
             </w:pPr>
             <w:r>
               <w:t xml:space="preserve">Year awarded</w:t>
@@ -117,7 +122,6 @@
           <w:p>
             <w:pPr>
               <w:pStyle w:val="Compact"/>
-              <w:jc w:val="left"/>
             </w:pPr>
             <w:r>
               <w:t xml:space="preserve">Subject / classification</w:t>
@@ -131,7 +135,6 @@
           <w:p>
             <w:pPr>
               <w:pStyle w:val="Compact"/>
-              <w:jc w:val="left"/>
             </w:pPr>
             <w:r>
               <w:t xml:space="preserve">1</w:t>
@@ -143,7 +146,6 @@
           <w:p>
             <w:pPr>
               <w:pStyle w:val="Compact"/>
-              <w:jc w:val="left"/>
             </w:pPr>
             <w:r>
               <w:t xml:space="preserve">_______________</w:t>
@@ -155,7 +157,6 @@
           <w:p>
             <w:pPr>
               <w:pStyle w:val="Compact"/>
-              <w:jc w:val="left"/>
             </w:pPr>
             <w:r>
               <w:t xml:space="preserve">_______________</w:t>
@@ -167,7 +168,6 @@
           <w:p>
             <w:pPr>
               <w:pStyle w:val="Compact"/>
-              <w:jc w:val="left"/>
             </w:pPr>
             <w:r>
               <w:t xml:space="preserve">_______________</w:t>
@@ -179,7 +179,6 @@
           <w:p>
             <w:pPr>
               <w:pStyle w:val="Compact"/>
-              <w:jc w:val="left"/>
             </w:pPr>
             <w:r>
               <w:t xml:space="preserve">_______________</w:t>
@@ -193,7 +192,6 @@
           <w:p>
             <w:pPr>
               <w:pStyle w:val="Compact"/>
-              <w:jc w:val="left"/>
             </w:pPr>
             <w:r>
               <w:t xml:space="preserve">2</w:t>
@@ -205,7 +203,6 @@
           <w:p>
             <w:pPr>
               <w:pStyle w:val="Compact"/>
-              <w:jc w:val="left"/>
             </w:pPr>
             <w:r>
               <w:t xml:space="preserve">_______________</w:t>
@@ -217,7 +214,6 @@
           <w:p>
             <w:pPr>
               <w:pStyle w:val="Compact"/>
-              <w:jc w:val="left"/>
             </w:pPr>
             <w:r>
               <w:t xml:space="preserve">_______________</w:t>
@@ -229,7 +225,6 @@
           <w:p>
             <w:pPr>
               <w:pStyle w:val="Compact"/>
-              <w:jc w:val="left"/>
             </w:pPr>
             <w:r>
               <w:t xml:space="preserve">_______________</w:t>
@@ -241,7 +236,6 @@
           <w:p>
             <w:pPr>
               <w:pStyle w:val="Compact"/>
-              <w:jc w:val="left"/>
             </w:pPr>
             <w:r>
               <w:t xml:space="preserve">_______________</w:t>
@@ -255,7 +249,6 @@
           <w:p>
             <w:pPr>
               <w:pStyle w:val="Compact"/>
-              <w:jc w:val="left"/>
             </w:pPr>
             <w:r>
               <w:t xml:space="preserve">3</w:t>
@@ -267,7 +260,6 @@
           <w:p>
             <w:pPr>
               <w:pStyle w:val="Compact"/>
-              <w:jc w:val="left"/>
             </w:pPr>
             <w:r>
               <w:t xml:space="preserve">_______________</w:t>
@@ -279,7 +271,6 @@
           <w:p>
             <w:pPr>
               <w:pStyle w:val="Compact"/>
-              <w:jc w:val="left"/>
             </w:pPr>
             <w:r>
               <w:t xml:space="preserve">_______________</w:t>
@@ -291,7 +282,6 @@
           <w:p>
             <w:pPr>
               <w:pStyle w:val="Compact"/>
-              <w:jc w:val="left"/>
             </w:pPr>
             <w:r>
               <w:t xml:space="preserve">_______________</w:t>
@@ -303,7 +293,6 @@
           <w:p>
             <w:pPr>
               <w:pStyle w:val="Compact"/>
-              <w:jc w:val="left"/>
             </w:pPr>
             <w:r>
               <w:t xml:space="preserve">_______________</w:t>
@@ -327,8 +316,8 @@
         </w:pict>
       </w:r>
     </w:p>
-    <w:bookmarkEnd w:id="20"/>
-    <w:bookmarkStart w:id="21" w:name="verification"/>
+    <w:bookmarkEnd w:id="9"/>
+    <w:bookmarkStart w:id="10" w:name="verification"/>
     <w:p>
       <w:pPr>
         <w:pStyle w:val="Heading2"/>
@@ -347,47 +336,47 @@
     </w:p>
     <w:p>
       <w:pPr>
+        <w:pStyle w:val="Compact"/>
         <w:numPr>
           <w:ilvl w:val="0"/>
           <w:numId w:val="1001"/>
         </w:numPr>
+      </w:pPr>
+      <w:r>
+        <w:t xml:space="preserve">Original certificate (scanned colour PDF + original on hand for in-person verification).</w:t>
+      </w:r>
+    </w:p>
+    <w:p>
+      <w:pPr>
         <w:pStyle w:val="Compact"/>
-      </w:pPr>
-      <w:r>
-        <w:t xml:space="preserve">Original certificate (scanned colour PDF + original on hand for in-person verification).</w:t>
-      </w:r>
-    </w:p>
-    <w:p>
-      <w:pPr>
         <w:numPr>
           <w:ilvl w:val="0"/>
           <w:numId w:val="1001"/>
         </w:numPr>
+      </w:pPr>
+      <w:r>
+        <w:t xml:space="preserve">Official transcript where applicable.</w:t>
+      </w:r>
+    </w:p>
+    <w:p>
+      <w:pPr>
         <w:pStyle w:val="Compact"/>
-      </w:pPr>
-      <w:r>
-        <w:t xml:space="preserve">Official transcript where applicable.</w:t>
-      </w:r>
-    </w:p>
-    <w:p>
-      <w:pPr>
         <w:numPr>
           <w:ilvl w:val="0"/>
           <w:numId w:val="1001"/>
         </w:numPr>
+      </w:pPr>
+      <w:r>
+        <w:t xml:space="preserve">UK NARIC / ECCTIS Statement of Comparability for any qualifications awarded outside the UK.</w:t>
+      </w:r>
+    </w:p>
+    <w:p>
+      <w:pPr>
         <w:pStyle w:val="Compact"/>
-      </w:pPr>
-      <w:r>
-        <w:t xml:space="preserve">UK NARIC / ECCTIS Statement of Comparability for any qualifications awarded outside the UK.</w:t>
-      </w:r>
-    </w:p>
-    <w:p>
-      <w:pPr>
         <w:numPr>
           <w:ilvl w:val="0"/>
           <w:numId w:val="1001"/>
         </w:numPr>
-        <w:pStyle w:val="Compact"/>
       </w:pPr>
       <w:r>
         <w:t xml:space="preserve">Independent English-language proficiency evidence (IELTS, TOEFL, Cambridge English, or a degree taught in English — whichever applies).</w:t>
@@ -400,8 +389,8 @@
         </w:pict>
       </w:r>
     </w:p>
-    <w:bookmarkEnd w:id="21"/>
-    <w:bookmarkStart w:id="22" w:name="document-register"/>
+    <w:bookmarkEnd w:id="10"/>
+    <w:bookmarkStart w:id="11" w:name="document-register"/>
     <w:p>
       <w:pPr>
         <w:pStyle w:val="Heading2"/>
@@ -413,7 +402,8 @@
     <w:tbl>
       <w:tblPr>
         <w:tblStyle w:val="Table"/>
-        <w:tblW w:type="auto" w:w="0"/>
+        <w:tblW w:type="pct" w:w="5000"/>
+        <w:tblLayout w:type="fixed"/>
         <w:tblLook w:firstRow="1" w:lastRow="0" w:firstColumn="0" w:lastColumn="0" w:noHBand="0" w:noVBand="0" w:val="0020"/>
       </w:tblPr>
       <w:tblGrid>
@@ -424,14 +414,13 @@
       </w:tblGrid>
       <w:tr>
         <w:trPr>
-          <w:tblHeader w:val="true"/>
+          <w:tblHeader w:val="on"/>
         </w:trPr>
         <w:tc>
           <w:tcPr/>
           <w:p>
             <w:pPr>
               <w:pStyle w:val="Compact"/>
-              <w:jc w:val="left"/>
             </w:pPr>
             <w:r>
               <w:t xml:space="preserve">Document</w:t>
@@ -443,7 +432,6 @@
           <w:p>
             <w:pPr>
               <w:pStyle w:val="Compact"/>
-              <w:jc w:val="left"/>
             </w:pPr>
             <w:r>
               <w:t xml:space="preserve">Location</w:t>
@@ -455,7 +443,6 @@
           <w:p>
             <w:pPr>
               <w:pStyle w:val="Compact"/>
-              <w:jc w:val="left"/>
             </w:pPr>
             <w:r>
               <w:t xml:space="preserve">Format</w:t>
@@ -467,7 +454,6 @@
           <w:p>
             <w:pPr>
               <w:pStyle w:val="Compact"/>
-              <w:jc w:val="left"/>
             </w:pPr>
             <w:r>
               <w:t xml:space="preserve">Notes</w:t>
@@ -481,7 +467,6 @@
           <w:p>
             <w:pPr>
               <w:pStyle w:val="Compact"/>
-              <w:jc w:val="left"/>
             </w:pPr>
             <w:r>
               <w:t xml:space="preserve">Degree certificate</w:t>
@@ -493,7 +478,6 @@
           <w:p>
             <w:pPr>
               <w:pStyle w:val="Compact"/>
-              <w:jc w:val="left"/>
             </w:pPr>
             <w:r>
               <w:t xml:space="preserve">/app/visa_appendices/A_supporting/degree_cert.pdf</w:t>
@@ -505,7 +489,6 @@
           <w:p>
             <w:pPr>
               <w:pStyle w:val="Compact"/>
-              <w:jc w:val="left"/>
             </w:pPr>
             <w:r>
               <w:t xml:space="preserve">PDF</w:t>
@@ -517,12 +500,11 @@
           <w:p>
             <w:pPr>
               <w:pStyle w:val="Compact"/>
-              <w:jc w:val="left"/>
             </w:pPr>
             <w:r>
               <w:rPr>
+                <w:i/>
                 <w:iCs/>
-                <w:i/>
               </w:rPr>
               <w:t xml:space="preserve">Applicant to upload</w:t>
             </w:r>
@@ -535,7 +517,6 @@
           <w:p>
             <w:pPr>
               <w:pStyle w:val="Compact"/>
-              <w:jc w:val="left"/>
             </w:pPr>
             <w:r>
               <w:t xml:space="preserve">Degree transcript</w:t>
@@ -547,7 +528,6 @@
           <w:p>
             <w:pPr>
               <w:pStyle w:val="Compact"/>
-              <w:jc w:val="left"/>
             </w:pPr>
             <w:r>
               <w:t xml:space="preserve">/app/visa_appendices/A_supporting/transcript.pdf</w:t>
@@ -559,7 +539,6 @@
           <w:p>
             <w:pPr>
               <w:pStyle w:val="Compact"/>
-              <w:jc w:val="left"/>
             </w:pPr>
             <w:r>
               <w:t xml:space="preserve">PDF</w:t>
@@ -571,12 +550,11 @@
           <w:p>
             <w:pPr>
               <w:pStyle w:val="Compact"/>
-              <w:jc w:val="left"/>
             </w:pPr>
             <w:r>
               <w:rPr>
+                <w:i/>
                 <w:iCs/>
-                <w:i/>
               </w:rPr>
               <w:t xml:space="preserve">Applicant to upload</w:t>
             </w:r>
@@ -589,7 +567,6 @@
           <w:p>
             <w:pPr>
               <w:pStyle w:val="Compact"/>
-              <w:jc w:val="left"/>
             </w:pPr>
             <w:r>
               <w:t xml:space="preserve">ECCTIS statement (if applicable)</w:t>
@@ -601,7 +578,6 @@
           <w:p>
             <w:pPr>
               <w:pStyle w:val="Compact"/>
-              <w:jc w:val="left"/>
             </w:pPr>
             <w:r>
               <w:t xml:space="preserve">/app/visa_appendices/A_supporting/ecctis.pdf</w:t>
@@ -613,7 +589,6 @@
           <w:p>
             <w:pPr>
               <w:pStyle w:val="Compact"/>
-              <w:jc w:val="left"/>
             </w:pPr>
             <w:r>
               <w:t xml:space="preserve">PDF</w:t>
@@ -625,12 +600,11 @@
           <w:p>
             <w:pPr>
               <w:pStyle w:val="Compact"/>
-              <w:jc w:val="left"/>
             </w:pPr>
             <w:r>
               <w:rPr>
+                <w:i/>
                 <w:iCs/>
-                <w:i/>
               </w:rPr>
               <w:t xml:space="preserve">Applicant to upload</w:t>
             </w:r>
@@ -643,7 +617,6 @@
           <w:p>
             <w:pPr>
               <w:pStyle w:val="Compact"/>
-              <w:jc w:val="left"/>
             </w:pPr>
             <w:r>
               <w:t xml:space="preserve">Professional certifications</w:t>
@@ -655,7 +628,6 @@
           <w:p>
             <w:pPr>
               <w:pStyle w:val="Compact"/>
-              <w:jc w:val="left"/>
             </w:pPr>
             <w:r>
               <w:t xml:space="preserve">/app/visa_appendices/A_supporting/certs/</w:t>
@@ -667,7 +639,6 @@
           <w:p>
             <w:pPr>
               <w:pStyle w:val="Compact"/>
-              <w:jc w:val="left"/>
             </w:pPr>
             <w:r>
               <w:t xml:space="preserve">PDFs</w:t>
@@ -679,12 +650,11 @@
           <w:p>
             <w:pPr>
               <w:pStyle w:val="Compact"/>
-              <w:jc w:val="left"/>
             </w:pPr>
             <w:r>
               <w:rPr>
+                <w:i/>
                 <w:iCs/>
-                <w:i/>
               </w:rPr>
               <w:t xml:space="preserve">Applicant to upload</w:t>
             </w:r>
@@ -699,8 +669,8 @@
         </w:pict>
       </w:r>
     </w:p>
-    <w:bookmarkEnd w:id="22"/>
-    <w:bookmarkStart w:id="23" w:name="applicant-statement"/>
+    <w:bookmarkEnd w:id="11"/>
+    <w:bookmarkStart w:id="12" w:name="applicant-statement"/>
     <w:p>
       <w:pPr>
         <w:pStyle w:val="Heading2"/>
@@ -723,8 +693,8 @@
       </w:pPr>
       <w:r>
         <w:rPr>
+          <w:b/>
           <w:bCs/>
-          <w:b/>
         </w:rPr>
         <w:t xml:space="preserve">Signature:</w:t>
       </w:r>
@@ -741,8 +711,8 @@
       </w:pPr>
       <w:r>
         <w:rPr>
+          <w:b/>
           <w:bCs/>
-          <w:b/>
         </w:rPr>
         <w:t xml:space="preserve">Date:</w:t>
       </w:r>
@@ -753,9 +723,13 @@
         <w:t xml:space="preserve">___________________________________</w:t>
       </w:r>
     </w:p>
-    <w:bookmarkEnd w:id="23"/>
-    <w:bookmarkEnd w:id="24"/>
-    <w:sectPr/>
+    <w:bookmarkEnd w:id="12"/>
+    <w:bookmarkEnd w:id="13"/>
+    <w:sectPr>
+      <w:footnotePr>
+        <w:numRestart w:val="eachSect"/>
+      </w:footnotePr>
+    </w:sectPr>
   </w:body>
 </w:document>
 </file>
@@ -786,14 +760,14 @@
 <file path=word/numbering.xml><?xml version="1.0" encoding="utf-8"?>
 <w:numbering xmlns:w="http://schemas.openxmlformats.org/wordprocessingml/2006/main">
   <w:abstractNum w:abstractNumId="990">
-    <w:nsid w:val="A990"/>
+    <w:nsid w:val="0000A990"/>
     <w:multiLevelType w:val="multilevel"/>
     <w:lvl w:ilvl="0">
       <w:numFmt w:val="bullet"/>
       <w:lvlText w:val=" "/>
       <w:lvlJc w:val="left"/>
       <w:pPr>
-        <w:ind w:left="720" w:hanging="480"/>
+        <w:ind w:left="720" w:hanging="360"/>
       </w:pPr>
     </w:lvl>
     <w:lvl w:ilvl="1">
@@ -801,7 +775,7 @@
       <w:lvlText w:val=" "/>
       <w:lvlJc w:val="left"/>
       <w:pPr>
-        <w:ind w:left="1440" w:hanging="480"/>
+        <w:ind w:left="1440" w:hanging="360"/>
       </w:pPr>
     </w:lvl>
     <w:lvl w:ilvl="2">
@@ -809,7 +783,7 @@
       <w:lvlText w:val=" "/>
       <w:lvlJc w:val="left"/>
       <w:pPr>
-        <w:ind w:left="2160" w:hanging="480"/>
+        <w:ind w:left="2160" w:hanging="360"/>
       </w:pPr>
     </w:lvl>
     <w:lvl w:ilvl="3">
@@ -817,7 +791,7 @@
       <w:lvlText w:val=" "/>
       <w:lvlJc w:val="left"/>
       <w:pPr>
-        <w:ind w:left="2880" w:hanging="480"/>
+        <w:ind w:left="2880" w:hanging="360"/>
       </w:pPr>
     </w:lvl>
     <w:lvl w:ilvl="4">
@@ -825,7 +799,7 @@
       <w:lvlText w:val=" "/>
       <w:lvlJc w:val="left"/>
       <w:pPr>
-        <w:ind w:left="3600" w:hanging="480"/>
+        <w:ind w:left="3600" w:hanging="360"/>
       </w:pPr>
     </w:lvl>
     <w:lvl w:ilvl="5">
@@ -833,7 +807,7 @@
       <w:lvlText w:val=" "/>
       <w:lvlJc w:val="left"/>
       <w:pPr>
-        <w:ind w:left="4320" w:hanging="480"/>
+        <w:ind w:left="4320" w:hanging="360"/>
       </w:pPr>
     </w:lvl>
     <w:lvl w:ilvl="6">
@@ -841,7 +815,7 @@
       <w:lvlText w:val=" "/>
       <w:lvlJc w:val="left"/>
       <w:pPr>
-        <w:ind w:left="5040" w:hanging="480"/>
+        <w:ind w:left="5040" w:hanging="360"/>
       </w:pPr>
     </w:lvl>
     <w:lvl w:ilvl="7">
@@ -849,7 +823,7 @@
       <w:lvlText w:val=" "/>
       <w:lvlJc w:val="left"/>
       <w:pPr>
-        <w:ind w:left="5760" w:hanging="480"/>
+        <w:ind w:left="5760" w:hanging="360"/>
       </w:pPr>
     </w:lvl>
     <w:lvl w:ilvl="8">
@@ -857,12 +831,12 @@
       <w:lvlText w:val=" "/>
       <w:lvlJc w:val="left"/>
       <w:pPr>
-        <w:ind w:left="6480" w:hanging="480"/>
+        <w:ind w:left="6480" w:hanging="360"/>
       </w:pPr>
     </w:lvl>
   </w:abstractNum>
   <w:abstractNum w:abstractNumId="99411">
-    <w:nsid w:val="A99411"/>
+    <w:nsid w:val="00A99411"/>
     <w:multiLevelType w:val="multilevel"/>
     <w:lvl w:ilvl="0">
       <w:start w:val="1"/>
@@ -870,7 +844,7 @@
       <w:lvlText w:val="%1."/>
       <w:lvlJc w:val="left"/>
       <w:pPr>
-        <w:ind w:left="720" w:hanging="480"/>
+        <w:ind w:left="720" w:hanging="360"/>
       </w:pPr>
     </w:lvl>
     <w:lvl w:ilvl="1">
@@ -879,7 +853,7 @@
       <w:lvlText w:val="%2."/>
       <w:lvlJc w:val="left"/>
       <w:pPr>
-        <w:ind w:left="1440" w:hanging="480"/>
+        <w:ind w:left="1440" w:hanging="360"/>
       </w:pPr>
     </w:lvl>
     <w:lvl w:ilvl="2">
@@ -888,7 +862,7 @@
       <w:lvlText w:val="%3."/>
       <w:lvlJc w:val="left"/>
       <w:pPr>
-        <w:ind w:left="2160" w:hanging="480"/>
+        <w:ind w:left="2160" w:hanging="360"/>
       </w:pPr>
     </w:lvl>
     <w:lvl w:ilvl="3">
@@ -897,7 +871,7 @@
       <w:lvlText w:val="%4."/>
       <w:lvlJc w:val="left"/>
       <w:pPr>
-        <w:ind w:left="2880" w:hanging="480"/>
+        <w:ind w:left="2880" w:hanging="360"/>
       </w:pPr>
     </w:lvl>
     <w:lvl w:ilvl="4">
@@ -906,7 +880,7 @@
       <w:lvlText w:val="%5."/>
       <w:lvlJc w:val="left"/>
       <w:pPr>
-        <w:ind w:left="3600" w:hanging="480"/>
+        <w:ind w:left="3600" w:hanging="360"/>
       </w:pPr>
     </w:lvl>
     <w:lvl w:ilvl="5">
@@ -915,7 +889,7 @@
       <w:lvlText w:val="%6."/>
       <w:lvlJc w:val="left"/>
       <w:pPr>
-        <w:ind w:left="4320" w:hanging="480"/>
+        <w:ind w:left="4320" w:hanging="360"/>
       </w:pPr>
     </w:lvl>
     <w:lvl w:ilvl="6">
@@ -924,7 +898,7 @@
       <w:lvlText w:val="%7."/>
       <w:lvlJc w:val="left"/>
       <w:pPr>
-        <w:ind w:left="5040" w:hanging="480"/>
+        <w:ind w:left="5040" w:hanging="360"/>
       </w:pPr>
     </w:lvl>
     <w:lvl w:ilvl="7">
@@ -933,7 +907,7 @@
       <w:lvlText w:val="%8."/>
       <w:lvlJc w:val="left"/>
       <w:pPr>
-        <w:ind w:left="5760" w:hanging="480"/>
+        <w:ind w:left="5760" w:hanging="360"/>
       </w:pPr>
     </w:lvl>
     <w:lvl w:ilvl="8">
@@ -942,7 +916,7 @@
       <w:lvlText w:val="%9."/>
       <w:lvlJc w:val="left"/>
       <w:pPr>
-        <w:ind w:left="6480" w:hanging="480"/>
+        <w:ind w:left="6480" w:hanging="360"/>
       </w:pPr>
     </w:lvl>
   </w:abstractNum>
@@ -987,10 +961,10 @@
   <w:docDefaults>
     <w:rPrDefault>
       <w:rPr>
-        <w:rFonts w:asciiTheme="minorHAnsi" w:cstheme="minorBidi" w:eastAsiaTheme="minorHAnsi" w:hAnsiTheme="minorHAnsi"/>
+        <w:rFonts w:asciiTheme="minorHAnsi" w:cstheme="minorBidi" w:eastAsiaTheme="minorEastAsia" w:hAnsiTheme="minorHAnsi"/>
         <w:sz w:val="24"/>
         <w:szCs w:val="24"/>
-        <w:lang w:bidi="ar-SA" w:eastAsia="en-US" w:val="en-US"/>
+        <w:lang w:bidi="ar-SA" w:eastAsia="zh-CN" w:val="en-US"/>
       </w:rPr>
     </w:rPrDefault>
     <w:pPrDefault>
@@ -1008,10 +982,10 @@
     <w:name w:val="Body Text"/>
     <w:basedOn w:val="Normal"/>
     <w:link w:val="BodyTextChar"/>
+    <w:qFormat/>
     <w:pPr>
       <w:spacing w:after="180" w:before="180"/>
     </w:pPr>
-    <w:qFormat/>
   </w:style>
   <w:style w:customStyle="1" w:styleId="FirstParagraph" w:type="paragraph">
     <w:name w:val="First Paragraph"/>
@@ -1031,57 +1005,111 @@
     <w:name w:val="Title"/>
     <w:basedOn w:val="Normal"/>
     <w:next w:val="BodyText"/>
-    <w:qFormat/>
-    <w:pPr>
-      <w:keepNext/>
-      <w:keepLines/>
-      <w:spacing w:after="240" w:before="480"/>
+    <w:link w:val="TitleChar"/>
+    <w:uiPriority w:val="10"/>
+    <w:qFormat/>
+    <w:rsid w:val="00A10FD9"/>
+    <w:pPr>
+      <w:spacing w:after="80" w:line="240" w:lineRule="auto"/>
+      <w:contextualSpacing/>
       <w:jc w:val="center"/>
     </w:pPr>
     <w:rPr>
       <w:rFonts w:asciiTheme="majorHAnsi" w:cstheme="majorBidi" w:eastAsiaTheme="majorEastAsia" w:hAnsiTheme="majorHAnsi"/>
-      <w:b/>
-      <w:bCs/>
-      <w:color w:themeColor="accent1" w:themeShade="B5" w:val="345A8A"/>
-      <w:sz w:val="36"/>
-      <w:szCs w:val="36"/>
+      <w:sz w:val="56"/>
+      <w:szCs w:val="56"/>
+    </w:rPr>
+  </w:style>
+  <w:style w:customStyle="1" w:styleId="TitleChar" w:type="character">
+    <w:name w:val="Title Char"/>
+    <w:basedOn w:val="DefaultParagraphFont"/>
+    <w:link w:val="Title"/>
+    <w:uiPriority w:val="10"/>
+    <w:rsid w:val="00A10FD9"/>
+    <w:rPr>
+      <w:rFonts w:asciiTheme="majorHAnsi" w:cstheme="majorBidi" w:eastAsiaTheme="majorEastAsia" w:hAnsiTheme="majorHAnsi"/>
+      <w:sz w:val="56"/>
+      <w:szCs w:val="56"/>
     </w:rPr>
   </w:style>
   <w:style w:styleId="Subtitle" w:type="paragraph">
     <w:name w:val="Subtitle"/>
     <w:basedOn w:val="Title"/>
     <w:next w:val="BodyText"/>
+    <w:link w:val="SubtitleChar"/>
+    <w:uiPriority w:val="11"/>
+    <w:qFormat/>
+    <w:rsid w:val="00A10FD9"/>
+    <w:pPr>
+      <w:numPr>
+        <w:ilvl w:val="1"/>
+      </w:numPr>
+    </w:pPr>
+    <w:rPr>
+      <w:rFonts w:cstheme="majorBidi" w:eastAsiaTheme="majorEastAsia"/>
+      <w:spacing w:val="15"/>
+      <w:sz w:val="28"/>
+      <w:szCs w:val="28"/>
+    </w:rPr>
+  </w:style>
+  <w:style w:customStyle="1" w:styleId="SubtitleChar" w:type="character">
+    <w:name w:val="Subtitle Char"/>
+    <w:basedOn w:val="DefaultParagraphFont"/>
+    <w:link w:val="Subtitle"/>
+    <w:uiPriority w:val="11"/>
+    <w:rsid w:val="00A10FD9"/>
+    <w:rPr>
+      <w:rFonts w:cstheme="majorBidi" w:eastAsiaTheme="majorEastAsia"/>
+      <w:color w:themeColor="text1" w:themeTint="A6" w:val="595959"/>
+      <w:spacing w:val="15"/>
+      <w:sz w:val="28"/>
+      <w:szCs w:val="28"/>
+    </w:rPr>
+  </w:style>
+  <w:style w:customStyle="1" w:styleId="Author" w:type="paragraph">
+    <w:name w:val="Author"/>
+    <w:basedOn w:val="Title"/>
+    <w:next w:val="BodyText"/>
     <w:qFormat/>
     <w:pPr>
       <w:keepNext/>
       <w:keepLines/>
-      <w:spacing w:after="240" w:before="240"/>
-      <w:jc w:val="center"/>
-    </w:pPr>
-    <w:rPr>
-      <w:sz w:val="30"/>
-      <w:szCs w:val="30"/>
-    </w:rPr>
-  </w:style>
-  <w:style w:customStyle="1" w:styleId="Author" w:type="paragraph">
-    <w:name w:val="Author"/>
+    </w:pPr>
+    <w:rPr>
+      <w:sz w:val="24"/>
+      <w:szCs w:val="24"/>
+    </w:rPr>
+  </w:style>
+  <w:style w:styleId="Date" w:type="paragraph">
+    <w:name w:val="Date"/>
+    <w:basedOn w:val="Title"/>
     <w:next w:val="BodyText"/>
     <w:qFormat/>
     <w:pPr>
       <w:keepNext/>
       <w:keepLines/>
-      <w:jc w:val="center"/>
-    </w:pPr>
-  </w:style>
-  <w:style w:styleId="Date" w:type="paragraph">
-    <w:name w:val="Date"/>
-    <w:next w:val="BodyText"/>
+    </w:pPr>
+    <w:rPr>
+      <w:sz w:val="24"/>
+      <w:szCs w:val="24"/>
+    </w:rPr>
+  </w:style>
+  <w:style w:customStyle="1" w:styleId="AbstractTitle" w:type="paragraph">
+    <w:name w:val="Abstract Title"/>
+    <w:basedOn w:val="Normal"/>
+    <w:next w:val="Abstract"/>
     <w:qFormat/>
     <w:pPr>
       <w:keepNext/>
       <w:keepLines/>
+      <w:spacing w:after="0" w:before="300"/>
       <w:jc w:val="center"/>
     </w:pPr>
+    <w:rPr>
+      <w:b/>
+      <w:sz w:val="20"/>
+      <w:szCs w:val="20"/>
+    </w:rPr>
   </w:style>
   <w:style w:customStyle="1" w:styleId="Abstract" w:type="paragraph">
     <w:name w:val="Abstract"/>
@@ -1091,7 +1119,7 @@
     <w:pPr>
       <w:keepNext/>
       <w:keepLines/>
-      <w:spacing w:after="300" w:before="300"/>
+      <w:spacing w:after="300" w:before="100"/>
     </w:pPr>
     <w:rPr>
       <w:sz w:val="20"/>
@@ -1107,191 +1135,321 @@
     <w:rPr/>
   </w:style>
   <w:style w:styleId="Heading1" w:type="paragraph">
-    <w:name w:val="Heading 1"/>
+    <w:name w:val="heading 1"/>
     <w:basedOn w:val="Normal"/>
     <w:next w:val="BodyText"/>
+    <w:link w:val="Heading1Char"/>
     <w:uiPriority w:val="9"/>
     <w:qFormat/>
+    <w:rsid w:val="00A10FD9"/>
     <w:pPr>
       <w:keepNext/>
       <w:keepLines/>
-      <w:spacing w:after="0" w:before="480"/>
+      <w:spacing w:after="80" w:before="360"/>
       <w:outlineLvl w:val="0"/>
     </w:pPr>
     <w:rPr>
       <w:rFonts w:asciiTheme="majorHAnsi" w:cstheme="majorBidi" w:eastAsiaTheme="majorEastAsia" w:hAnsiTheme="majorHAnsi"/>
-      <w:b/>
-      <w:bCs/>
-      <w:color w:themeColor="accent1" w:val="4F81BD"/>
+      <w:color w:themeColor="accent1" w:themeShade="BF" w:val="0F4761"/>
+      <w:sz w:val="40"/>
+      <w:szCs w:val="40"/>
+    </w:rPr>
+  </w:style>
+  <w:style w:styleId="Heading2" w:type="paragraph">
+    <w:name w:val="heading 2"/>
+    <w:basedOn w:val="Normal"/>
+    <w:next w:val="BodyText"/>
+    <w:link w:val="Heading2Char"/>
+    <w:uiPriority w:val="9"/>
+    <w:semiHidden/>
+    <w:unhideWhenUsed/>
+    <w:qFormat/>
+    <w:rsid w:val="00A10FD9"/>
+    <w:pPr>
+      <w:keepNext/>
+      <w:keepLines/>
+      <w:spacing w:after="80" w:before="160"/>
+      <w:outlineLvl w:val="1"/>
+    </w:pPr>
+    <w:rPr>
+      <w:rFonts w:asciiTheme="majorHAnsi" w:cstheme="majorBidi" w:eastAsiaTheme="majorEastAsia" w:hAnsiTheme="majorHAnsi"/>
+      <w:color w:themeColor="accent1" w:themeShade="BF" w:val="0F4761"/>
       <w:sz w:val="32"/>
       <w:szCs w:val="32"/>
     </w:rPr>
   </w:style>
-  <w:style w:styleId="Heading2" w:type="paragraph">
-    <w:name w:val="Heading 2"/>
+  <w:style w:styleId="Heading3" w:type="paragraph">
+    <w:name w:val="heading 3"/>
     <w:basedOn w:val="Normal"/>
     <w:next w:val="BodyText"/>
+    <w:link w:val="Heading3Char"/>
     <w:uiPriority w:val="9"/>
+    <w:semiHidden/>
     <w:unhideWhenUsed/>
     <w:qFormat/>
+    <w:rsid w:val="00A10FD9"/>
     <w:pPr>
       <w:keepNext/>
       <w:keepLines/>
-      <w:spacing w:after="0" w:before="200"/>
-      <w:outlineLvl w:val="1"/>
-    </w:pPr>
-    <w:rPr>
-      <w:rFonts w:asciiTheme="majorHAnsi" w:cstheme="majorBidi" w:eastAsiaTheme="majorEastAsia" w:hAnsiTheme="majorHAnsi"/>
-      <w:b/>
-      <w:bCs/>
-      <w:color w:themeColor="accent1" w:val="4F81BD"/>
+      <w:spacing w:after="80" w:before="160"/>
+      <w:outlineLvl w:val="2"/>
+    </w:pPr>
+    <w:rPr>
+      <w:rFonts w:cstheme="majorBidi" w:eastAsiaTheme="majorEastAsia"/>
+      <w:color w:themeColor="accent1" w:themeShade="BF" w:val="0F4761"/>
       <w:sz w:val="28"/>
       <w:szCs w:val="28"/>
     </w:rPr>
   </w:style>
-  <w:style w:styleId="Heading3" w:type="paragraph">
-    <w:name w:val="Heading 3"/>
+  <w:style w:styleId="Heading4" w:type="paragraph">
+    <w:name w:val="heading 4"/>
     <w:basedOn w:val="Normal"/>
     <w:next w:val="BodyText"/>
+    <w:link w:val="Heading4Char"/>
     <w:uiPriority w:val="9"/>
+    <w:semiHidden/>
     <w:unhideWhenUsed/>
     <w:qFormat/>
+    <w:rsid w:val="00A10FD9"/>
     <w:pPr>
       <w:keepNext/>
       <w:keepLines/>
-      <w:spacing w:after="0" w:before="200"/>
-      <w:outlineLvl w:val="2"/>
-    </w:pPr>
-    <w:rPr>
-      <w:rFonts w:asciiTheme="majorHAnsi" w:cstheme="majorBidi" w:eastAsiaTheme="majorEastAsia" w:hAnsiTheme="majorHAnsi"/>
-      <w:b/>
-      <w:bCs/>
-      <w:color w:themeColor="accent1" w:val="4F81BD"/>
-      <w:sz w:val="24"/>
-      <w:szCs w:val="24"/>
-    </w:rPr>
-  </w:style>
-  <w:style w:styleId="Heading4" w:type="paragraph">
-    <w:name w:val="Heading 4"/>
+      <w:spacing w:after="40" w:before="80"/>
+      <w:outlineLvl w:val="3"/>
+    </w:pPr>
+    <w:rPr>
+      <w:rFonts w:cstheme="majorBidi" w:eastAsiaTheme="majorEastAsia"/>
+      <w:i/>
+      <w:iCs/>
+      <w:color w:themeColor="accent1" w:themeShade="BF" w:val="0F4761"/>
+    </w:rPr>
+  </w:style>
+  <w:style w:styleId="Heading5" w:type="paragraph">
+    <w:name w:val="heading 5"/>
     <w:basedOn w:val="Normal"/>
     <w:next w:val="BodyText"/>
+    <w:link w:val="Heading5Char"/>
     <w:uiPriority w:val="9"/>
+    <w:semiHidden/>
     <w:unhideWhenUsed/>
     <w:qFormat/>
+    <w:rsid w:val="00A10FD9"/>
     <w:pPr>
       <w:keepNext/>
       <w:keepLines/>
-      <w:spacing w:after="0" w:before="200"/>
-      <w:outlineLvl w:val="3"/>
-    </w:pPr>
-    <w:rPr>
-      <w:rFonts w:asciiTheme="majorHAnsi" w:cstheme="majorBidi" w:eastAsiaTheme="majorEastAsia" w:hAnsiTheme="majorHAnsi"/>
-      <w:i/>
-      <w:bCs/>
-      <w:color w:themeColor="accent1" w:val="4F81BD"/>
-      <w:sz w:val="24"/>
-      <w:szCs w:val="24"/>
-    </w:rPr>
-  </w:style>
-  <w:style w:styleId="Heading5" w:type="paragraph">
-    <w:name w:val="Heading 5"/>
+      <w:spacing w:after="40" w:before="80"/>
+      <w:outlineLvl w:val="4"/>
+    </w:pPr>
+    <w:rPr>
+      <w:rFonts w:cstheme="majorBidi" w:eastAsiaTheme="majorEastAsia"/>
+      <w:color w:themeColor="accent1" w:themeShade="BF" w:val="0F4761"/>
+    </w:rPr>
+  </w:style>
+  <w:style w:styleId="Heading6" w:type="paragraph">
+    <w:name w:val="heading 6"/>
     <w:basedOn w:val="Normal"/>
     <w:next w:val="BodyText"/>
+    <w:link w:val="Heading6Char"/>
     <w:uiPriority w:val="9"/>
+    <w:semiHidden/>
     <w:unhideWhenUsed/>
     <w:qFormat/>
+    <w:rsid w:val="00A10FD9"/>
     <w:pPr>
       <w:keepNext/>
       <w:keepLines/>
-      <w:spacing w:after="0" w:before="200"/>
-      <w:outlineLvl w:val="4"/>
-    </w:pPr>
-    <w:rPr>
-      <w:rFonts w:asciiTheme="majorHAnsi" w:cstheme="majorBidi" w:eastAsiaTheme="majorEastAsia" w:hAnsiTheme="majorHAnsi"/>
+      <w:spacing w:after="0" w:before="40"/>
+      <w:outlineLvl w:val="5"/>
+    </w:pPr>
+    <w:rPr>
+      <w:rFonts w:cstheme="majorBidi" w:eastAsiaTheme="majorEastAsia"/>
+      <w:i/>
       <w:iCs/>
-      <w:color w:themeColor="accent1" w:val="4F81BD"/>
-      <w:sz w:val="24"/>
-      <w:szCs w:val="24"/>
-    </w:rPr>
-  </w:style>
-  <w:style w:styleId="Heading6" w:type="paragraph">
-    <w:name w:val="Heading 6"/>
+      <w:color w:themeColor="text1" w:themeTint="A6" w:val="595959"/>
+    </w:rPr>
+  </w:style>
+  <w:style w:styleId="Heading7" w:type="paragraph">
+    <w:name w:val="heading 7"/>
     <w:basedOn w:val="Normal"/>
     <w:next w:val="BodyText"/>
+    <w:link w:val="Heading7Char"/>
     <w:uiPriority w:val="9"/>
+    <w:semiHidden/>
     <w:unhideWhenUsed/>
     <w:qFormat/>
+    <w:rsid w:val="00A10FD9"/>
     <w:pPr>
       <w:keepNext/>
       <w:keepLines/>
-      <w:spacing w:after="0" w:before="200"/>
-      <w:outlineLvl w:val="5"/>
-    </w:pPr>
-    <w:rPr>
-      <w:rFonts w:asciiTheme="majorHAnsi" w:cstheme="majorBidi" w:eastAsiaTheme="majorEastAsia" w:hAnsiTheme="majorHAnsi"/>
-      <w:color w:themeColor="accent1" w:val="4F81BD"/>
-      <w:sz w:val="24"/>
-      <w:szCs w:val="24"/>
-    </w:rPr>
-  </w:style>
-  <w:style w:styleId="Heading7" w:type="paragraph">
-    <w:name w:val="Heading 7"/>
+      <w:spacing w:after="0" w:before="40"/>
+      <w:outlineLvl w:val="6"/>
+    </w:pPr>
+    <w:rPr>
+      <w:rFonts w:cstheme="majorBidi" w:eastAsiaTheme="majorEastAsia"/>
+      <w:color w:themeColor="text1" w:themeTint="A6" w:val="595959"/>
+    </w:rPr>
+  </w:style>
+  <w:style w:styleId="Heading8" w:type="paragraph">
+    <w:name w:val="heading 8"/>
     <w:basedOn w:val="Normal"/>
     <w:next w:val="BodyText"/>
+    <w:link w:val="Heading8Char"/>
     <w:uiPriority w:val="9"/>
+    <w:semiHidden/>
     <w:unhideWhenUsed/>
     <w:qFormat/>
+    <w:rsid w:val="00A10FD9"/>
     <w:pPr>
       <w:keepNext/>
       <w:keepLines/>
-      <w:spacing w:after="0" w:before="200"/>
-      <w:outlineLvl w:val="6"/>
-    </w:pPr>
-    <w:rPr>
-      <w:rFonts w:asciiTheme="majorHAnsi" w:cstheme="majorBidi" w:eastAsiaTheme="majorEastAsia" w:hAnsiTheme="majorHAnsi"/>
-      <w:color w:themeColor="accent1" w:val="4F81BD"/>
-      <w:sz w:val="24"/>
-      <w:szCs w:val="24"/>
-    </w:rPr>
-  </w:style>
-  <w:style w:styleId="Heading8" w:type="paragraph">
-    <w:name w:val="Heading 8"/>
+      <w:spacing w:after="0"/>
+      <w:outlineLvl w:val="7"/>
+    </w:pPr>
+    <w:rPr>
+      <w:rFonts w:cstheme="majorBidi" w:eastAsiaTheme="majorEastAsia"/>
+      <w:i/>
+      <w:iCs/>
+      <w:color w:themeColor="text1" w:themeTint="D8" w:val="272727"/>
+    </w:rPr>
+  </w:style>
+  <w:style w:styleId="Heading9" w:type="paragraph">
+    <w:name w:val="heading 9"/>
     <w:basedOn w:val="Normal"/>
     <w:next w:val="BodyText"/>
+    <w:link w:val="Heading9Char"/>
     <w:uiPriority w:val="9"/>
+    <w:semiHidden/>
     <w:unhideWhenUsed/>
     <w:qFormat/>
+    <w:rsid w:val="00A10FD9"/>
     <w:pPr>
       <w:keepNext/>
       <w:keepLines/>
-      <w:spacing w:after="0" w:before="200"/>
-      <w:outlineLvl w:val="7"/>
-    </w:pPr>
+      <w:spacing w:after="0"/>
+      <w:outlineLvl w:val="8"/>
+    </w:pPr>
+    <w:rPr>
+      <w:rFonts w:cstheme="majorBidi" w:eastAsiaTheme="majorEastAsia"/>
+      <w:color w:themeColor="text1" w:themeTint="D8" w:val="272727"/>
+    </w:rPr>
+  </w:style>
+  <w:style w:customStyle="1" w:styleId="Heading1Char" w:type="character">
+    <w:name w:val="Heading 1 Char"/>
+    <w:basedOn w:val="DefaultParagraphFont"/>
+    <w:link w:val="Heading1"/>
+    <w:uiPriority w:val="9"/>
+    <w:rsid w:val="00A10FD9"/>
     <w:rPr>
       <w:rFonts w:asciiTheme="majorHAnsi" w:cstheme="majorBidi" w:eastAsiaTheme="majorEastAsia" w:hAnsiTheme="majorHAnsi"/>
-      <w:color w:themeColor="accent1" w:val="4F81BD"/>
-      <w:sz w:val="24"/>
-      <w:szCs w:val="24"/>
-    </w:rPr>
-  </w:style>
-  <w:style w:styleId="Heading9" w:type="paragraph">
-    <w:name w:val="Heading 9"/>
-    <w:basedOn w:val="Normal"/>
-    <w:next w:val="BodyText"/>
+      <w:color w:themeColor="accent1" w:themeShade="BF" w:val="0F4761"/>
+      <w:sz w:val="40"/>
+      <w:szCs w:val="40"/>
+    </w:rPr>
+  </w:style>
+  <w:style w:customStyle="1" w:styleId="Heading2Char" w:type="character">
+    <w:name w:val="Heading 2 Char"/>
+    <w:basedOn w:val="DefaultParagraphFont"/>
+    <w:link w:val="Heading2"/>
     <w:uiPriority w:val="9"/>
-    <w:unhideWhenUsed/>
-    <w:qFormat/>
-    <w:pPr>
-      <w:keepNext/>
-      <w:keepLines/>
-      <w:spacing w:after="0" w:before="200"/>
-      <w:outlineLvl w:val="8"/>
-    </w:pPr>
+    <w:semiHidden/>
+    <w:rsid w:val="00A10FD9"/>
     <w:rPr>
       <w:rFonts w:asciiTheme="majorHAnsi" w:cstheme="majorBidi" w:eastAsiaTheme="majorEastAsia" w:hAnsiTheme="majorHAnsi"/>
-      <w:color w:themeColor="accent1" w:val="4F81BD"/>
-      <w:sz w:val="24"/>
-      <w:szCs w:val="24"/>
+      <w:color w:themeColor="accent1" w:themeShade="BF" w:val="0F4761"/>
+      <w:sz w:val="32"/>
+      <w:szCs w:val="32"/>
+    </w:rPr>
+  </w:style>
+  <w:style w:customStyle="1" w:styleId="Heading3Char" w:type="character">
+    <w:name w:val="Heading 3 Char"/>
+    <w:basedOn w:val="DefaultParagraphFont"/>
+    <w:link w:val="Heading3"/>
+    <w:uiPriority w:val="9"/>
+    <w:semiHidden/>
+    <w:rsid w:val="00A10FD9"/>
+    <w:rPr>
+      <w:rFonts w:cstheme="majorBidi" w:eastAsiaTheme="majorEastAsia"/>
+      <w:color w:themeColor="accent1" w:themeShade="BF" w:val="0F4761"/>
+      <w:sz w:val="28"/>
+      <w:szCs w:val="28"/>
+    </w:rPr>
+  </w:style>
+  <w:style w:customStyle="1" w:styleId="Heading4Char" w:type="character">
+    <w:name w:val="Heading 4 Char"/>
+    <w:basedOn w:val="DefaultParagraphFont"/>
+    <w:link w:val="Heading4"/>
+    <w:uiPriority w:val="9"/>
+    <w:semiHidden/>
+    <w:rsid w:val="00A10FD9"/>
+    <w:rPr>
+      <w:rFonts w:cstheme="majorBidi" w:eastAsiaTheme="majorEastAsia"/>
+      <w:i/>
+      <w:iCs/>
+      <w:color w:themeColor="accent1" w:themeShade="BF" w:val="0F4761"/>
+    </w:rPr>
+  </w:style>
+  <w:style w:customStyle="1" w:styleId="Heading5Char" w:type="character">
+    <w:name w:val="Heading 5 Char"/>
+    <w:basedOn w:val="DefaultParagraphFont"/>
+    <w:link w:val="Heading5"/>
+    <w:uiPriority w:val="9"/>
+    <w:semiHidden/>
+    <w:rsid w:val="00A10FD9"/>
+    <w:rPr>
+      <w:rFonts w:cstheme="majorBidi" w:eastAsiaTheme="majorEastAsia"/>
+      <w:color w:themeColor="accent1" w:themeShade="BF" w:val="0F4761"/>
+    </w:rPr>
+  </w:style>
+  <w:style w:customStyle="1" w:styleId="Heading6Char" w:type="character">
+    <w:name w:val="Heading 6 Char"/>
+    <w:basedOn w:val="DefaultParagraphFont"/>
+    <w:link w:val="Heading6"/>
+    <w:uiPriority w:val="9"/>
+    <w:semiHidden/>
+    <w:rsid w:val="00A10FD9"/>
+    <w:rPr>
+      <w:rFonts w:cstheme="majorBidi" w:eastAsiaTheme="majorEastAsia"/>
+      <w:i/>
+      <w:iCs/>
+      <w:color w:themeColor="text1" w:themeTint="A6" w:val="595959"/>
+    </w:rPr>
+  </w:style>
+  <w:style w:customStyle="1" w:styleId="Heading7Char" w:type="character">
+    <w:name w:val="Heading 7 Char"/>
+    <w:basedOn w:val="DefaultParagraphFont"/>
+    <w:link w:val="Heading7"/>
+    <w:uiPriority w:val="9"/>
+    <w:semiHidden/>
+    <w:rsid w:val="00A10FD9"/>
+    <w:rPr>
+      <w:rFonts w:cstheme="majorBidi" w:eastAsiaTheme="majorEastAsia"/>
+      <w:color w:themeColor="text1" w:themeTint="A6" w:val="595959"/>
+    </w:rPr>
+  </w:style>
+  <w:style w:customStyle="1" w:styleId="Heading8Char" w:type="character">
+    <w:name w:val="Heading 8 Char"/>
+    <w:basedOn w:val="DefaultParagraphFont"/>
+    <w:link w:val="Heading8"/>
+    <w:uiPriority w:val="9"/>
+    <w:semiHidden/>
+    <w:rsid w:val="00A10FD9"/>
+    <w:rPr>
+      <w:rFonts w:cstheme="majorBidi" w:eastAsiaTheme="majorEastAsia"/>
+      <w:i/>
+      <w:iCs/>
+      <w:color w:themeColor="text1" w:themeTint="D8" w:val="272727"/>
+    </w:rPr>
+  </w:style>
+  <w:style w:customStyle="1" w:styleId="Heading9Char" w:type="character">
+    <w:name w:val="Heading 9 Char"/>
+    <w:basedOn w:val="DefaultParagraphFont"/>
+    <w:link w:val="Heading9"/>
+    <w:uiPriority w:val="9"/>
+    <w:semiHidden/>
+    <w:rsid w:val="00A10FD9"/>
+    <w:rPr>
+      <w:rFonts w:cstheme="majorBidi" w:eastAsiaTheme="majorEastAsia"/>
+      <w:color w:themeColor="text1" w:themeTint="D8" w:val="272727"/>
     </w:rPr>
   </w:style>
   <w:style w:styleId="BlockText" w:type="paragraph">
@@ -1313,6 +1471,18 @@
     <w:uiPriority w:val="9"/>
     <w:unhideWhenUsed/>
     <w:qFormat/>
+  </w:style>
+  <w:style w:styleId="FootnoteBlockText" w:type="paragraph">
+    <w:name w:val="Footnote Block Text"/>
+    <w:basedOn w:val="FootnoteText"/>
+    <w:next w:val="FootnoteText"/>
+    <w:uiPriority w:val="9"/>
+    <w:unhideWhenUsed/>
+    <w:qFormat/>
+    <w:pPr>
+      <w:spacing w:after="100" w:before="100"/>
+      <w:ind w:firstLine="0" w:left="480" w:right="480"/>
+    </w:pPr>
   </w:style>
   <w:style w:default="1" w:styleId="DefaultParagraphFont" w:type="character">
     <w:name w:val="Default Paragraph Font"/>
@@ -1335,18 +1505,11 @@
       </w:tblCellMar>
     </w:tblPr>
     <w:tblStylePr w:type="firstRow">
-      <w:tblPr>
-        <w:jc w:val="left"/>
-        <w:tblInd w:type="dxa" w:w="0"/>
-      </w:tblPr>
-      <w:trPr>
-        <w:jc w:val="left"/>
-      </w:trPr>
       <w:tcPr>
-        <w:vAlign w:val="bottom"/>
         <w:tcBorders>
           <w:bottom w:val="single"/>
         </w:tcBorders>
+        <w:vAlign w:val="bottom"/>
       </w:tcPr>
     </w:tblStylePr>
   </w:style>
@@ -1461,8 +1624,8 @@
     <w:name w:val="KeywordTok"/>
     <w:basedOn w:val="VerbatimChar"/>
     <w:rPr>
+      <w:b/>
       <w:color w:val="007020"/>
-      <w:b/>
     </w:rPr>
   </w:style>
   <w:style w:type="character" w:customStyle="1" w:styleId="DataTypeTok">
@@ -1539,42 +1702,42 @@
     <w:name w:val="ImportTok"/>
     <w:basedOn w:val="VerbatimChar"/>
     <w:rPr>
+      <w:b/>
       <w:color w:val="008000"/>
-      <w:b/>
     </w:rPr>
   </w:style>
   <w:style w:type="character" w:customStyle="1" w:styleId="CommentTok">
     <w:name w:val="CommentTok"/>
     <w:basedOn w:val="VerbatimChar"/>
     <w:rPr>
+      <w:i/>
       <w:color w:val="60a0b0"/>
-      <w:i/>
     </w:rPr>
   </w:style>
   <w:style w:type="character" w:customStyle="1" w:styleId="DocumentationTok">
     <w:name w:val="DocumentationTok"/>
     <w:basedOn w:val="VerbatimChar"/>
     <w:rPr>
+      <w:i/>
       <w:color w:val="ba2121"/>
-      <w:i/>
     </w:rPr>
   </w:style>
   <w:style w:type="character" w:customStyle="1" w:styleId="AnnotationTok">
     <w:name w:val="AnnotationTok"/>
     <w:basedOn w:val="VerbatimChar"/>
     <w:rPr>
-      <w:color w:val="60a0b0"/>
       <w:b/>
       <w:i/>
+      <w:color w:val="60a0b0"/>
     </w:rPr>
   </w:style>
   <w:style w:type="character" w:customStyle="1" w:styleId="CommentVarTok">
     <w:name w:val="CommentVarTok"/>
     <w:basedOn w:val="VerbatimChar"/>
     <w:rPr>
-      <w:color w:val="60a0b0"/>
       <w:b/>
       <w:i/>
+      <w:color w:val="60a0b0"/>
     </w:rPr>
   </w:style>
   <w:style w:type="character" w:customStyle="1" w:styleId="OtherTok">
@@ -1602,8 +1765,8 @@
     <w:name w:val="ControlFlowTok"/>
     <w:basedOn w:val="VerbatimChar"/>
     <w:rPr>
+      <w:b/>
       <w:color w:val="007020"/>
-      <w:b/>
     </w:rPr>
   </w:style>
   <w:style w:type="character" w:customStyle="1" w:styleId="OperatorTok">
@@ -1648,34 +1811,34 @@
     <w:name w:val="InformationTok"/>
     <w:basedOn w:val="VerbatimChar"/>
     <w:rPr>
-      <w:color w:val="60a0b0"/>
       <w:b/>
       <w:i/>
+      <w:color w:val="60a0b0"/>
     </w:rPr>
   </w:style>
   <w:style w:type="character" w:customStyle="1" w:styleId="WarningTok">
     <w:name w:val="WarningTok"/>
     <w:basedOn w:val="VerbatimChar"/>
     <w:rPr>
-      <w:color w:val="60a0b0"/>
       <w:b/>
       <w:i/>
+      <w:color w:val="60a0b0"/>
     </w:rPr>
   </w:style>
   <w:style w:type="character" w:customStyle="1" w:styleId="AlertTok">
     <w:name w:val="AlertTok"/>
     <w:basedOn w:val="VerbatimChar"/>
     <w:rPr>
+      <w:b/>
       <w:color w:val="ff0000"/>
-      <w:b/>
     </w:rPr>
   </w:style>
   <w:style w:type="character" w:customStyle="1" w:styleId="ErrorTok">
     <w:name w:val="ErrorTok"/>
     <w:basedOn w:val="VerbatimChar"/>
     <w:rPr>
+      <w:b/>
       <w:color w:val="ff0000"/>
-      <w:b/>
     </w:rPr>
   </w:style>
   <w:style w:type="character" w:customStyle="1" w:styleId="NormalTok">
@@ -1697,44 +1860,44 @@
         <a:sysClr val="window" lastClr="FFFFFF"/>
       </a:lt1>
       <a:dk2>
-        <a:srgbClr val="1F497D"/>
+        <a:srgbClr val="0E2841"/>
       </a:dk2>
       <a:lt2>
-        <a:srgbClr val="EEECE1"/>
+        <a:srgbClr val="E8E8E8"/>
       </a:lt2>
       <a:accent1>
-        <a:srgbClr val="4F81BD"/>
+        <a:srgbClr val="156082"/>
       </a:accent1>
       <a:accent2>
-        <a:srgbClr val="C0504D"/>
+        <a:srgbClr val="E97132"/>
       </a:accent2>
       <a:accent3>
-        <a:srgbClr val="9BBB59"/>
+        <a:srgbClr val="196B24"/>
       </a:accent3>
       <a:accent4>
-        <a:srgbClr val="8064A2"/>
+        <a:srgbClr val="0F9ED5"/>
       </a:accent4>
       <a:accent5>
-        <a:srgbClr val="4BACC6"/>
+        <a:srgbClr val="A02B93"/>
       </a:accent5>
       <a:accent6>
-        <a:srgbClr val="F79646"/>
+        <a:srgbClr val="4EA72E"/>
       </a:accent6>
       <a:hlink>
-        <a:srgbClr val="0000FF"/>
+        <a:srgbClr val="467886"/>
       </a:hlink>
       <a:folHlink>
-        <a:srgbClr val="800080"/>
+        <a:srgbClr val="96607D"/>
       </a:folHlink>
     </a:clrScheme>
     <a:fontScheme name="Office">
       <a:majorFont>
-        <a:latin typeface="Calibri"/>
+        <a:latin typeface="Aptos Display" panose="02110004020202020204"/>
         <a:ea typeface=""/>
         <a:cs typeface=""/>
-        <a:font script="Jpan" typeface="ＭＳ ゴシック"/>
+        <a:font script="Jpan" typeface="游ゴシック Light"/>
         <a:font script="Hang" typeface="맑은 고딕"/>
-        <a:font script="Hans" typeface="宋体"/>
+        <a:font script="Hans" typeface="等线 Light"/>
         <a:font script="Hant" typeface="新細明體"/>
         <a:font script="Arab" typeface="Times New Roman"/>
         <a:font script="Hebr" typeface="Times New Roman"/>
@@ -1761,14 +1924,32 @@
         <a:font script="Mong" typeface="Mongolian Baiti"/>
         <a:font script="Viet" typeface="Times New Roman"/>
         <a:font script="Uigh" typeface="Microsoft Uighur"/>
+        <a:font script="Geor" typeface="Sylfaen"/>
+        <a:font script="Armn" typeface="Arial"/>
+        <a:font script="Bugi" typeface="Leelawadee UI"/>
+        <a:font script="Bopo" typeface="Microsoft JhengHei"/>
+        <a:font script="Java" typeface="Javanese Text"/>
+        <a:font script="Lisu" typeface="Segoe UI"/>
+        <a:font script="Mymr" typeface="Myanmar Text"/>
+        <a:font script="Nkoo" typeface="Ebrima"/>
+        <a:font script="Olck" typeface="Nirmala UI"/>
+        <a:font script="Osma" typeface="Ebrima"/>
+        <a:font script="Phag" typeface="Phagspa"/>
+        <a:font script="Syrn" typeface="Estrangelo Edessa"/>
+        <a:font script="Syrj" typeface="Estrangelo Edessa"/>
+        <a:font script="Syre" typeface="Estrangelo Edessa"/>
+        <a:font script="Sora" typeface="Nirmala UI"/>
+        <a:font script="Tale" typeface="Microsoft Tai Le"/>
+        <a:font script="Talu" typeface="Microsoft New Tai Lue"/>
+        <a:font script="Tfng" typeface="Ebrima"/>
       </a:majorFont>
       <a:minorFont>
-        <a:latin typeface="Cambria"/>
+        <a:latin typeface="Aptos" panose="02110004020202020204"/>
         <a:ea typeface=""/>
         <a:cs typeface=""/>
-        <a:font script="Jpan" typeface="ＭＳ 明朝"/>
+        <a:font script="Jpan" typeface="游明朝"/>
         <a:font script="Hang" typeface="맑은 고딕"/>
-        <a:font script="Hans" typeface="宋体"/>
+        <a:font script="Hans" typeface="等线"/>
         <a:font script="Hant" typeface="新細明體"/>
         <a:font script="Arab" typeface="Arial"/>
         <a:font script="Hebr" typeface="Arial"/>
@@ -1795,6 +1976,24 @@
         <a:font script="Mong" typeface="Mongolian Baiti"/>
         <a:font script="Viet" typeface="Arial"/>
         <a:font script="Uigh" typeface="Microsoft Uighur"/>
+        <a:font script="Geor" typeface="Sylfaen"/>
+        <a:font script="Armn" typeface="Arial"/>
+        <a:font script="Bugi" typeface="Leelawadee UI"/>
+        <a:font script="Bopo" typeface="Microsoft JhengHei"/>
+        <a:font script="Java" typeface="Javanese Text"/>
+        <a:font script="Lisu" typeface="Segoe UI"/>
+        <a:font script="Mymr" typeface="Myanmar Text"/>
+        <a:font script="Nkoo" typeface="Ebrima"/>
+        <a:font script="Olck" typeface="Nirmala UI"/>
+        <a:font script="Osma" typeface="Ebrima"/>
+        <a:font script="Phag" typeface="Phagspa"/>
+        <a:font script="Syrn" typeface="Estrangelo Edessa"/>
+        <a:font script="Syrj" typeface="Estrangelo Edessa"/>
+        <a:font script="Syre" typeface="Estrangelo Edessa"/>
+        <a:font script="Sora" typeface="Nirmala UI"/>
+        <a:font script="Tale" typeface="Microsoft Tai Le"/>
+        <a:font script="Talu" typeface="Microsoft New Tai Lue"/>
+        <a:font script="Tfng" typeface="Ebrima"/>
       </a:minorFont>
     </a:fontScheme>
     <a:fmtScheme name="Office">
@@ -1806,200 +2005,141 @@
           <a:gsLst>
             <a:gs pos="0">
               <a:schemeClr val="phClr">
-                <a:tint val="50000"/>
-                <a:satMod val="300000"/>
+                <a:lumMod val="110000"/>
+                <a:satMod val="105000"/>
+                <a:tint val="67000"/>
               </a:schemeClr>
             </a:gs>
-            <a:gs pos="35000">
+            <a:gs pos="50000">
               <a:schemeClr val="phClr">
-                <a:tint val="37000"/>
-                <a:satMod val="300000"/>
+                <a:lumMod val="105000"/>
+                <a:satMod val="103000"/>
+                <a:tint val="73000"/>
               </a:schemeClr>
             </a:gs>
             <a:gs pos="100000">
               <a:schemeClr val="phClr">
-                <a:tint val="15000"/>
-                <a:satMod val="350000"/>
+                <a:lumMod val="105000"/>
+                <a:satMod val="109000"/>
+                <a:tint val="81000"/>
               </a:schemeClr>
             </a:gs>
           </a:gsLst>
-          <a:lin ang="16200000" scaled="1"/>
+          <a:lin ang="5400000" scaled="0"/>
         </a:gradFill>
         <a:gradFill rotWithShape="1">
           <a:gsLst>
             <a:gs pos="0">
               <a:schemeClr val="phClr">
-                <a:tint val="100000"/>
+                <a:satMod val="103000"/>
+                <a:lumMod val="102000"/>
+                <a:tint val="94000"/>
+              </a:schemeClr>
+            </a:gs>
+            <a:gs pos="50000">
+              <a:schemeClr val="phClr">
+                <a:satMod val="110000"/>
+                <a:lumMod val="100000"/>
                 <a:shade val="100000"/>
-                <a:satMod val="130000"/>
               </a:schemeClr>
             </a:gs>
             <a:gs pos="100000">
               <a:schemeClr val="phClr">
-                <a:tint val="50000"/>
-                <a:shade val="100000"/>
-                <a:satMod val="350000"/>
+                <a:lumMod val="99000"/>
+                <a:satMod val="120000"/>
+                <a:shade val="78000"/>
               </a:schemeClr>
             </a:gs>
           </a:gsLst>
-          <a:lin ang="16200000" scaled="0"/>
+          <a:lin ang="5400000" scaled="0"/>
         </a:gradFill>
       </a:fillStyleLst>
       <a:lnStyleLst>
-        <a:ln w="9525" cap="flat" cmpd="sng" algn="ctr">
-          <a:solidFill>
-            <a:schemeClr val="phClr">
-              <a:shade val="95000"/>
-              <a:satMod val="105000"/>
-            </a:schemeClr>
-          </a:solidFill>
-          <a:prstDash val="solid"/>
-        </a:ln>
-        <a:ln w="25400" cap="flat" cmpd="sng" algn="ctr">
+        <a:ln w="6350" cap="flat" cmpd="sng" algn="ctr">
           <a:solidFill>
             <a:schemeClr val="phClr"/>
           </a:solidFill>
           <a:prstDash val="solid"/>
+          <a:miter lim="800000"/>
         </a:ln>
-        <a:ln w="38100" cap="flat" cmpd="sng" algn="ctr">
+        <a:ln w="12700" cap="flat" cmpd="sng" algn="ctr">
           <a:solidFill>
             <a:schemeClr val="phClr"/>
           </a:solidFill>
           <a:prstDash val="solid"/>
+          <a:miter lim="800000"/>
+        </a:ln>
+        <a:ln w="19050" cap="flat" cmpd="sng" algn="ctr">
+          <a:solidFill>
+            <a:schemeClr val="phClr"/>
+          </a:solidFill>
+          <a:prstDash val="solid"/>
+          <a:miter lim="800000"/>
         </a:ln>
       </a:lnStyleLst>
       <a:effectStyleLst>
         <a:effectStyle>
+          <a:effectLst/>
+        </a:effectStyle>
+        <a:effectStyle>
+          <a:effectLst/>
+        </a:effectStyle>
+        <a:effectStyle>
           <a:effectLst>
-            <a:outerShdw blurRad="40000" dist="20000" dir="5400000" rotWithShape="0">
+            <a:outerShdw blurRad="57150" dist="19050" dir="5400000" algn="ctr" rotWithShape="0">
               <a:srgbClr val="000000">
-                <a:alpha val="38000"/>
+                <a:alpha val="63000"/>
               </a:srgbClr>
             </a:outerShdw>
           </a:effectLst>
-        </a:effectStyle>
-        <a:effectStyle>
-          <a:effectLst>
-            <a:outerShdw blurRad="40000" dist="23000" dir="5400000" rotWithShape="0">
-              <a:srgbClr val="000000">
-                <a:alpha val="35000"/>
-              </a:srgbClr>
-            </a:outerShdw>
-          </a:effectLst>
-        </a:effectStyle>
-        <a:effectStyle>
-          <a:effectLst>
-            <a:outerShdw blurRad="40000" dist="23000" dir="5400000" rotWithShape="0">
-              <a:srgbClr val="000000">
-                <a:alpha val="35000"/>
-              </a:srgbClr>
-            </a:outerShdw>
-          </a:effectLst>
-          <a:scene3d>
-            <a:camera prst="orthographicFront">
-              <a:rot lat="0" lon="0" rev="0"/>
-            </a:camera>
-            <a:lightRig rig="threePt" dir="t">
-              <a:rot lat="0" lon="0" rev="1200000"/>
-            </a:lightRig>
-          </a:scene3d>
-          <a:sp3d>
-            <a:bevelT w="63500" h="25400"/>
-          </a:sp3d>
         </a:effectStyle>
       </a:effectStyleLst>
       <a:bgFillStyleLst>
         <a:solidFill>
           <a:schemeClr val="phClr"/>
         </a:solidFill>
+        <a:solidFill>
+          <a:schemeClr val="phClr">
+            <a:tint val="95000"/>
+            <a:satMod val="170000"/>
+          </a:schemeClr>
+        </a:solidFill>
         <a:gradFill rotWithShape="1">
           <a:gsLst>
             <a:gs pos="0">
               <a:schemeClr val="phClr">
-                <a:tint val="40000"/>
-                <a:satMod val="350000"/>
+                <a:tint val="93000"/>
+                <a:satMod val="150000"/>
+                <a:shade val="98000"/>
+                <a:lumMod val="102000"/>
               </a:schemeClr>
             </a:gs>
-            <a:gs pos="40000">
+            <a:gs pos="50000">
               <a:schemeClr val="phClr">
-                <a:tint val="45000"/>
-                <a:shade val="99000"/>
-                <a:satMod val="350000"/>
+                <a:tint val="98000"/>
+                <a:satMod val="130000"/>
+                <a:shade val="90000"/>
+                <a:lumMod val="103000"/>
               </a:schemeClr>
             </a:gs>
             <a:gs pos="100000">
               <a:schemeClr val="phClr">
-                <a:shade val="20000"/>
-                <a:satMod val="255000"/>
+                <a:shade val="63000"/>
+                <a:satMod val="120000"/>
               </a:schemeClr>
             </a:gs>
           </a:gsLst>
-          <a:path path="circle">
-            <a:fillToRect l="50000" t="-80000" r="50000" b="180000"/>
-          </a:path>
-        </a:gradFill>
-        <a:gradFill rotWithShape="1">
-          <a:gsLst>
-            <a:gs pos="0">
-              <a:schemeClr val="phClr">
-                <a:tint val="80000"/>
-                <a:satMod val="300000"/>
-              </a:schemeClr>
-            </a:gs>
-            <a:gs pos="100000">
-              <a:schemeClr val="phClr">
-                <a:shade val="30000"/>
-                <a:satMod val="200000"/>
-              </a:schemeClr>
-            </a:gs>
-          </a:gsLst>
-          <a:path path="circle">
-            <a:fillToRect l="50000" t="50000" r="50000" b="50000"/>
-          </a:path>
+          <a:lin ang="5400000" scaled="0"/>
         </a:gradFill>
       </a:bgFillStyleLst>
     </a:fmtScheme>
   </a:themeElements>
-  <a:objectDefaults>
-    <a:spDef>
-      <a:spPr/>
-      <a:bodyPr/>
-      <a:lstStyle/>
-      <a:style>
-        <a:lnRef idx="1">
-          <a:schemeClr val="accent1"/>
-        </a:lnRef>
-        <a:fillRef idx="3">
-          <a:schemeClr val="accent1"/>
-        </a:fillRef>
-        <a:effectRef idx="2">
-          <a:schemeClr val="accent1"/>
-        </a:effectRef>
-        <a:fontRef idx="minor">
-          <a:schemeClr val="lt1"/>
-        </a:fontRef>
-      </a:style>
-    </a:spDef>
-    <a:lnDef>
-      <a:spPr/>
-      <a:bodyPr/>
-      <a:lstStyle/>
-      <a:style>
-        <a:lnRef idx="2">
-          <a:schemeClr val="accent1"/>
-        </a:lnRef>
-        <a:fillRef idx="0">
-          <a:schemeClr val="accent1"/>
-        </a:fillRef>
-        <a:effectRef idx="1">
-          <a:schemeClr val="accent1"/>
-        </a:effectRef>
-        <a:fontRef idx="minor">
-          <a:schemeClr val="tx1"/>
-        </a:fontRef>
-      </a:style>
-    </a:lnDef>
-  </a:objectDefaults>
+  <a:objectDefaults/>
   <a:extraClrSchemeLst/>
+  <a:extLst>
+    <a:ext uri="{05A4C25C-085E-4340-85A3-A5531E510DB2}">
+      <thm15:themeFamily xmlns:thm15="http://schemas.microsoft.com/office/thememl/2012/main" name="Office Theme" id="{2E142A2C-CD16-42D6-873A-C26D2A0506FA}" vid="{1BDDFF52-6CD6-40A5-AB3C-68EB2F1E4D0A}"/>
+    </a:ext>
+  </a:extLst>
 </a:theme>
 </file>
</xml_diff>

<commit_message>
Regenerate all PDF/DOCX exports for the CTO CV fix
Full rebuild of every appendix PDF (pitch deck + build_ukes_pdf.py,
including the merged DEQUAD_UKES_FULL_SUBMISSION.pdf) and every DOCX
export via pandoc, so the whole export set is back in sync with the
markdown source after this session's audit pass across all appendices.

Co-Authored-By: Claude Sonnet 5 <noreply@anthropic.com>
</commit_message>
<xml_diff>
--- a/visa_appendices/docx/A_founder_academic_certificates.docx
+++ b/visa_appendices/docx/A_founder_academic_certificates.docx
@@ -2,14 +2,6 @@
 <file path=word/document.xml><?xml version="1.0" encoding="utf-8"?>
 <w:document xmlns:w="http://schemas.openxmlformats.org/wordprocessingml/2006/main" xmlns:m="http://schemas.openxmlformats.org/officeDocument/2006/math" xmlns:r="http://schemas.openxmlformats.org/officeDocument/2006/relationships" xmlns:o="urn:schemas-microsoft-com:office:office" xmlns:v="urn:schemas-microsoft-com:vml" xmlns:w10="urn:schemas-microsoft-com:office:word" xmlns:a="http://schemas.openxmlformats.org/drawingml/2006/main" xmlns:pic="http://schemas.openxmlformats.org/drawingml/2006/picture" xmlns:wp="http://schemas.openxmlformats.org/drawingml/2006/wordprocessingDrawing">
   <w:body>
-    <w:p>
-      <w:pPr>
-        <w:pStyle w:val="Title"/>
-      </w:pPr>
-      <w:r>
-        <w:t xml:space="preserve">A_founder_academic_certificates</w:t>
-      </w:r>
-    </w:p>
     <w:bookmarkStart w:id="13" w:name="appendix-a-founder-academic-certificates"/>
     <w:p>
       <w:pPr>

</xml_diff>